<commit_message>
docs(finals): align proposal and user guide with editable web workbench
</commit_message>
<xml_diff>
--- a/决赛提交/技术方案说明书.docx
+++ b/决赛提交/技术方案说明书.docx
@@ -179,7 +179,7 @@
         <w:ind w:firstLine="420"/>
       </w:pPr>
       <w:r>
-        <w:t>word2jats 面向这一过程，接收 DOCX 稿件，生成符合 JATS Journal Publishing 1.3 的 XML 文档及配套图片资源，并提供网页校样、原稿对照、复核记录和结果导出。编辑可以在同一工作台完成稿件提交、结构化转换和结果检查；技术人员也可以通过命令行调用相同的转换流程。</w:t>
+        <w:t>word2jats 面向这一过程，接收 DOCX 稿件，生成符合 JATS Journal Publishing 1.3 的 XML 文档及配套图片资源，并提供网页预览、原稿对照、文章信息修改和结果导出。用户可以在同一工作台完成稿件提交、结构化转换与校订；技术人员也可以通过命令行调用相同的转换流程。</w:t>
       </w:r>
     </w:p>
     <w:p>
@@ -1745,7 +1745,7 @@
         <w:ind w:firstLine="420"/>
       </w:pPr>
       <w:r>
-        <w:t>网页采用 FastAPI 提供上传、任务状态、预览、复核保存和下载接口。转换在后台执行，前端可以持续显示进度；大文件采用分片上传和失败重传，并在合并后核对文件大小与校验摘要（哈希值），确认上传完整。模型凭据保存在服务端配置中。</w:t>
+        <w:t>网页采用 FastAPI 提供上传、任务状态、预览、修订保存和下载接口。转换在后台执行，前端持续显示处理阶段；大文件采用分片上传和失败重传，合并后核对文件大小，浏览器支持时还对不超过 64 MiB 的文件校验 SHA-256 摘要。已完成任务的状态与结果保存到磁盘，服务重启后仍可通过原任务链接打开。模型凭据保存在服务端配置中。</w:t>
       </w:r>
     </w:p>
     <w:p>
@@ -1820,7 +1820,15 @@
         <w:ind w:firstLine="420"/>
       </w:pPr>
       <w:r>
-        <w:t>编辑上传 Word，按需要补充 DOI 与期刊信息，并选择模型配置。完成转换后，工作台同时提供成品预览、原文核对、内容清单、合规检查和 XML 源文件五个视图，如</w:t>
+        <w:t>工作台为不希望部署环境、运行转换脚本的用户提供直接操作入口。用户上传 Word，选择 DeepSeek 或 Qwen；DOI 与期刊信息可在上传时填写，也可在转换后补充。上传完成后，页面依次显示读取文档、识别结构、生成文件和检查结果等阶段，刷新页面可继续查看进度。</w:t>
+      </w:r>
+    </w:p>
+    <w:p>
+      <w:pPr>
+        <w:ind w:firstLine="420"/>
+      </w:pPr>
+      <w:r>
+        <w:t>结果页以稿件预览为主体，目录可跳转到章节、图、表和参考文献，如</w:t>
       </w:r>
       <w:hyperlink w:anchor="figure_3" w:history="1">
         <w:r>
@@ -1833,15 +1841,7 @@
         </w:r>
       </w:hyperlink>
       <w:r>
-        <w:t>所示。</w:t>
-      </w:r>
-    </w:p>
-    <w:p>
-      <w:pPr>
-        <w:ind w:firstLine="420"/>
-      </w:pPr>
-      <w:r>
-        <w:t>成品预览以阅读论文的方式呈现章节、图表、公式和文献，支持在结构化结果中浏览关联内容。内容清单帮助编辑检查作者、图表及文献等对象；XML 视图供技术人员核查具体标记。不同视图共用同一份转换结果，编辑无需在多个工具之间重新组织稿件。</w:t>
+        <w:t>所示。用户可以直接下载，也可以按需打开文章信息、出版信息、原稿与检查详情。XML 视图供需要核查具体标记的用户查看。各入口围绕同一份稿件组织，避免在多个页面间反复寻找对应内容。</w:t>
       </w:r>
     </w:p>
     <w:p>
@@ -1853,7 +1853,7 @@
       <w:r>
         <w:drawing>
           <wp:inline xmlns:a="http://schemas.openxmlformats.org/drawingml/2006/main" xmlns:pic="http://schemas.openxmlformats.org/drawingml/2006/picture">
-            <wp:extent cx="6120000" cy="3825000"/>
+            <wp:extent cx="6120000" cy="4250000"/>
             <wp:docPr id="3" name="Picture 3"/>
             <wp:cNvGraphicFramePr>
               <a:graphicFrameLocks noChangeAspect="1"/>
@@ -1874,7 +1874,7 @@
                   <pic:spPr>
                     <a:xfrm>
                       <a:off x="0" y="0"/>
-                      <a:ext cx="6120000" cy="3825000"/>
+                      <a:ext cx="6120000" cy="4250000"/>
                     </a:xfrm>
                     <a:prstGeom prst="rect"/>
                   </pic:spPr>
@@ -1901,7 +1901,7 @@
         <w:pageBreakBefore w:val="0"/>
       </w:pPr>
       <w:r>
-        <w:t>5.2 把复核工作定位到原稿</w:t>
+        <w:t>5.2 原稿对照与受控修订</w:t>
       </w:r>
     </w:p>
     <w:p>
@@ -1909,7 +1909,7 @@
         <w:ind w:firstLine="420"/>
       </w:pPr>
       <w:r>
-        <w:t>需要核对的事项按内容组织，并给出对应的原稿摘录和处理建议。编辑可以针对具体事项记录“待核对”“已核对，保留当前结果”或“需修改后重新转换”，同时填写备注和复核人。</w:t>
+        <w:t>原稿视图直接读取上传的 DOCX，显示段落、粗斜体、上下标、表格、图片与原生公式。选择带有原稿位置记录的章节或段落，可在侧栏打开相关原文，并向上下浏览完整上下文；没有可靠位置记录时提供全稿对照。结果与原稿分别来自输出 XML 和输入 Word，能够用于检查两者的实际差异。</w:t>
       </w:r>
     </w:p>
     <w:p>
@@ -1917,7 +1917,7 @@
         <w:ind w:firstLine="420"/>
       </w:pPr>
       <w:r>
-        <w:t>例如，参考文献未充分拆分字段时，编辑可以对照完整著录判断是否满足交付要求；文本表格需要整理时，可以依据原稿摘录在 Word 中调整行列，再重新转换。相同原段落中的同类提示会合并呈现，减少重复阅读。</w:t>
+        <w:t>文章信息支持修改题名、已有作者的姓名与顺序、单位文字及作者单位关联、通讯作者与邮箱、ORCID；出版信息支持补充 DOI、刊名、ISSN 和出版方。例如，稿件未提供期刊信息时，用户可从提示直接打开表单，选择已配置期刊或填写自定义刊名与刊号，保存后更新实际 JATS 元数据。作者单位关联的修改则更新相应引用目标，不仅改变预览文字。</w:t>
       </w:r>
     </w:p>
     <w:p>
@@ -1925,7 +1925,20 @@
         <w:ind w:firstLine="420"/>
       </w:pPr>
       <w:r>
-        <w:t>复核记录与当前 XML 的文件校验摘要绑定，导出时注明对应版本。保存处理意见不会直接改写 XML；需要修改内容时，编辑修订 Word 后重新转换，再检查新结果。原稿修订、自动转换和编辑确认由此形成连续的加工过程，处理意见能够随成果交接。</w:t>
+        <w:t>修订限定在明确字段，保留未修改内容的行内格式、脚注、标识与其他关联。保存时校验输入格式及当前文件版本，为修改后的 XML 重新执行格式与结构检查，并同步更新预览和下载文件。原自动文件单独保留，用户可恢复原始版本；未保存提醒、失败时保留输入和版本冲突检查，减少误操作造成的内容丢失。</w:t>
+      </w:r>
+      <w:hyperlink w:anchor="figure_4" w:history="1">
+        <w:r>
+          <w:rPr>
+            <w:rFonts w:ascii="Times New Roman" w:hAnsi="Times New Roman" w:eastAsia="Noto Serif CJK SC"/>
+            <w:u w:val="single"/>
+            <w:color w:val="000000"/>
+          </w:rPr>
+          <w:t>图4</w:t>
+        </w:r>
+      </w:hyperlink>
+      <w:r>
+        <w:t>展示文章信息修改与当前稿件预览。</w:t>
       </w:r>
     </w:p>
     <w:p>
@@ -1937,7 +1950,7 @@
       <w:r>
         <w:drawing>
           <wp:inline xmlns:a="http://schemas.openxmlformats.org/drawingml/2006/main" xmlns:pic="http://schemas.openxmlformats.org/drawingml/2006/picture">
-            <wp:extent cx="6120000" cy="5346443"/>
+            <wp:extent cx="6120000" cy="4250000"/>
             <wp:docPr id="4" name="Picture 4"/>
             <wp:cNvGraphicFramePr>
               <a:graphicFrameLocks noChangeAspect="1"/>
@@ -1946,7 +1959,7 @@
               <a:graphicData uri="http://schemas.openxmlformats.org/drawingml/2006/picture">
                 <pic:pic>
                   <pic:nvPicPr>
-                    <pic:cNvPr id="0" name="逐项复核.png"/>
+                    <pic:cNvPr id="0" name="文章信息修订.png"/>
                     <pic:cNvPicPr/>
                   </pic:nvPicPr>
                   <pic:blipFill>
@@ -1958,7 +1971,7 @@
                   <pic:spPr>
                     <a:xfrm>
                       <a:off x="0" y="0"/>
-                      <a:ext cx="6120000" cy="5346443"/>
+                      <a:ext cx="6120000" cy="4250000"/>
                     </a:xfrm>
                     <a:prstGeom prst="rect"/>
                   </pic:spPr>
@@ -1976,7 +1989,7 @@
         <w:jc w:val="center"/>
       </w:pPr>
       <w:r>
-        <w:t>图4　原稿摘录与逐项复核</w:t>
+        <w:t>图4　文章信息修订与结果预览</w:t>
       </w:r>
     </w:p>
     <w:p>
@@ -1993,7 +2006,7 @@
         <w:ind w:firstLine="420"/>
       </w:pPr>
       <w:r>
-        <w:t>成果包包含 JATS XML、配套媒体、转换用量，以及已保存的人工复核记录。两种模型配置提供相同的操作界面和成果结构；本次转换的输入、输出和缓存用量在结果页展开查看，并同步进入下载包。</w:t>
+        <w:t>成果包包含当前保存版本的 JATS XML、配套媒体、检查摘要与转换用量；发生人工修订时附修改记录。下载包中的 XML 与页面预览对应同一版本，图片仍采用原稿中的资源。两种模型配置提供相同的操作界面和成果结构；输入、输出和缓存用量在结果页按需查看，并同步进入下载包。</w:t>
       </w:r>
     </w:p>
     <w:p>
@@ -2001,7 +2014,7 @@
         <w:ind w:firstLine="420"/>
       </w:pPr>
       <w:r>
-        <w:t>这一流程将结构化加工、校样确认和成果交接放在同一工作台中：模型与程序完成逐项识别和标记，编辑对照具体原文作出判断，交付时一并保存结构化成果与处理记录。</w:t>
+        <w:t>字段修订不重新调用模型，因此不会重复承担整篇识别的等待时间和模型消耗。涉及复杂表格或正文结构时，可整理 Word 后重新上传；同一原稿也可选择另一种模型重新转换，新任务不覆盖已有结果。这一流程将自动识别、原稿对照、针对性修改和版本一致的成果导出连接起来，使人工操作直接服务于稿件定稿。</w:t>
       </w:r>
     </w:p>
     <w:p>
@@ -15072,7 +15085,7 @@
         <w:ind w:firstLine="420"/>
       </w:pPr>
       <w:r>
-        <w:t>word2jats 的整体价值在于将结构识别与原文内容连接起来，并把结果检查落实到编辑能够操作的具体对象上。模型承担章节、字段及关联的识别，程序完成原文取回、资源导出和标准组装；需要判断的内容可回到 Word 核对，处理记录随成果交接。输出 XML 与媒体可用于后续排版、检索和出版系统集成，可运行原型则提供从上传到交付的直接使用入口。</w:t>
+        <w:t>word2jats 的整体价值在于将结构识别与原文内容连接起来，并把结果检查落实到编辑能够操作的具体对象上。模型承担章节、字段及关联的识别，程序完成原文取回、资源导出和标准组装；用户对照 Word 核实内容，修订文章与出版信息，并将修改同步到输出。XML 与媒体可用于后续排版、检索和出版系统集成，可运行原型则提供从上传到交付的直接使用入口。</w:t>
       </w:r>
     </w:p>
     <w:p>

</xml_diff>